<commit_message>
Remplacement des graphiques par des tableaux
Co-Authored-By: Claude Opus 5.5 <noreply@anthropic.com>
Claude-Session: https://claude.ai/code/session_01Dmc69vteUWZEiaLxyDFVke
</commit_message>
<xml_diff>
--- a/Diagnostic_emplois_competences_Mont-Riviere.docx
+++ b/Diagnostic_emplois_competences_Mont-Riviere.docx
@@ -900,52 +900,6 @@
     </w:tbl>
     <w:p>
       <w:pPr>
-        <w:spacing w:after="40" w:before="80"/>
-        <w:jc w:val="center"/>
-      </w:pPr>
-      <w:r>
-        <w:drawing>
-          <wp:inline distT="0" distB="0" distL="0" distR="0">
-            <wp:extent cx="5715000" cy="2286000"/>
-            <wp:effectExtent t="0" r="0" b="0" l="0"/>
-            <wp:docPr id="1" name="" descr="" title=""/>
-            <wp:cNvGraphicFramePr>
-              <a:graphicFrameLocks xmlns:a="http://schemas.openxmlformats.org/drawingml/2006/main" noChangeAspect="1"/>
-            </wp:cNvGraphicFramePr>
-            <a:graphic xmlns:a="http://schemas.openxmlformats.org/drawingml/2006/main">
-              <a:graphicData uri="http://schemas.openxmlformats.org/drawingml/2006/picture">
-                <pic:pic xmlns:pic="http://schemas.openxmlformats.org/drawingml/2006/picture">
-                  <pic:nvPicPr>
-                    <pic:cNvPr id="0" name="" descr=""/>
-                    <pic:cNvPicPr>
-                      <a:picLocks noChangeAspect="1" noChangeArrowheads="1"/>
-                    </pic:cNvPicPr>
-                  </pic:nvPicPr>
-                  <pic:blipFill>
-                    <a:blip r:embed="rId8" cstate="none"/>
-                    <a:srcRect/>
-                    <a:stretch>
-                      <a:fillRect/>
-                    </a:stretch>
-                  </pic:blipFill>
-                  <pic:spPr bwMode="auto">
-                    <a:xfrm>
-                      <a:off x="0" y="0"/>
-                      <a:ext cx="5715000" cy="2286000"/>
-                    </a:xfrm>
-                    <a:prstGeom prst="rect">
-                      <a:avLst/>
-                    </a:prstGeom>
-                  </pic:spPr>
-                </pic:pic>
-              </a:graphicData>
-            </a:graphic>
-          </wp:inline>
-        </w:drawing>
-      </w:r>
-    </w:p>
-    <w:p>
-      <w:pPr>
         <w:spacing w:after="140"/>
         <w:jc w:val="center"/>
       </w:pPr>
@@ -957,7 +911,7 @@
           <w:sz w:val="18"/>
           <w:szCs w:val="18"/>
         </w:rPr>
-        <w:t xml:space="preserve">Graphique 1 – Effectifs et âge moyen par direction (âge moyen ville pondéré par les effectifs)</w:t>
+        <w:t xml:space="preserve">Tableau 1 – Effectifs et âge moyen par direction (âge moyen ville pondéré par les effectifs)</w:t>
       </w:r>
     </w:p>
     <w:p>
@@ -1052,52 +1006,664 @@
         <w:t xml:space="preserve"> Une part importante d’agents entre 45 et 55 ans et peu de jeunes cadres : les départs seront groupés dans 10 à 15 ans, et le vivier d’encadrement de relève est aujourd’hui faible.</w:t>
       </w:r>
     </w:p>
-    <w:p>
-      <w:pPr>
-        <w:spacing w:after="40" w:before="80"/>
-        <w:jc w:val="center"/>
-      </w:pPr>
-      <w:r>
-        <w:drawing>
-          <wp:inline distT="0" distB="0" distL="0" distR="0">
-            <wp:extent cx="5715000" cy="1285875"/>
-            <wp:effectExtent t="0" r="0" b="0" l="0"/>
-            <wp:docPr id="1" name="" descr="" title=""/>
-            <wp:cNvGraphicFramePr>
-              <a:graphicFrameLocks xmlns:a="http://schemas.openxmlformats.org/drawingml/2006/main" noChangeAspect="1"/>
-            </wp:cNvGraphicFramePr>
-            <a:graphic xmlns:a="http://schemas.openxmlformats.org/drawingml/2006/main">
-              <a:graphicData uri="http://schemas.openxmlformats.org/drawingml/2006/picture">
-                <pic:pic xmlns:pic="http://schemas.openxmlformats.org/drawingml/2006/picture">
-                  <pic:nvPicPr>
-                    <pic:cNvPr id="0" name="" descr=""/>
-                    <pic:cNvPicPr>
-                      <a:picLocks noChangeAspect="1" noChangeArrowheads="1"/>
-                    </pic:cNvPicPr>
-                  </pic:nvPicPr>
-                  <pic:blipFill>
-                    <a:blip r:embed="rId9" cstate="none"/>
-                    <a:srcRect/>
-                    <a:stretch>
-                      <a:fillRect/>
-                    </a:stretch>
-                  </pic:blipFill>
-                  <pic:spPr bwMode="auto">
-                    <a:xfrm>
-                      <a:off x="0" y="0"/>
-                      <a:ext cx="5715000" cy="1285875"/>
-                    </a:xfrm>
-                    <a:prstGeom prst="rect">
-                      <a:avLst/>
-                    </a:prstGeom>
-                  </pic:spPr>
-                </pic:pic>
-              </a:graphicData>
-            </a:graphic>
-          </wp:inline>
-        </w:drawing>
-      </w:r>
-    </w:p>
+    <w:tbl>
+      <w:tblPr>
+        <w:tblW w:type="dxa" w:w="9638"/>
+        <w:tblBorders>
+          <w:top w:val="single" w:color="auto" w:sz="4"/>
+          <w:left w:val="single" w:color="auto" w:sz="4"/>
+          <w:bottom w:val="single" w:color="auto" w:sz="4"/>
+          <w:right w:val="single" w:color="auto" w:sz="4"/>
+          <w:insideH w:val="single" w:color="auto" w:sz="4"/>
+          <w:insideV w:val="single" w:color="auto" w:sz="4"/>
+        </w:tblBorders>
+      </w:tblPr>
+      <w:tblGrid>
+        <w:gridCol w:w="2600"/>
+        <w:gridCol w:w="1200"/>
+        <w:gridCol w:w="1800"/>
+        <w:gridCol w:w="4038"/>
+      </w:tblGrid>
+      <w:tr>
+        <w:trPr>
+          <w:tblHeader/>
+        </w:trPr>
+        <w:tc>
+          <w:tcPr>
+            <w:tcW w:type="dxa" w:w="2600"/>
+            <w:tcBorders>
+              <w:top w:val="single" w:color="BFBFBF" w:sz="4"/>
+              <w:left w:val="single" w:color="BFBFBF" w:sz="4"/>
+              <w:bottom w:val="single" w:color="BFBFBF" w:sz="4"/>
+              <w:right w:val="single" w:color="BFBFBF" w:sz="4"/>
+            </w:tcBorders>
+            <w:shd w:fill="1F4E79" w:color="auto" w:val="clear"/>
+            <w:tcMar>
+              <w:top w:type="dxa" w:w="50"/>
+              <w:left w:type="dxa" w:w="90"/>
+              <w:bottom w:type="dxa" w:w="50"/>
+              <w:right w:type="dxa" w:w="90"/>
+            </w:tcMar>
+            <w:vAlign w:val="center"/>
+          </w:tcPr>
+          <w:p>
+            <w:pPr>
+              <w:spacing w:after="0"/>
+            </w:pPr>
+            <w:r>
+              <w:rPr>
+                <w:b/>
+                <w:bCs/>
+                <w:color w:val="FFFFFF"/>
+                <w:sz w:val="18"/>
+                <w:szCs w:val="18"/>
+              </w:rPr>
+              <w:t xml:space="preserve">DST – tranche d’âge</w:t>
+            </w:r>
+          </w:p>
+        </w:tc>
+        <w:tc>
+          <w:tcPr>
+            <w:tcW w:type="dxa" w:w="1200"/>
+            <w:tcBorders>
+              <w:top w:val="single" w:color="BFBFBF" w:sz="4"/>
+              <w:left w:val="single" w:color="BFBFBF" w:sz="4"/>
+              <w:bottom w:val="single" w:color="BFBFBF" w:sz="4"/>
+              <w:right w:val="single" w:color="BFBFBF" w:sz="4"/>
+            </w:tcBorders>
+            <w:shd w:fill="1F4E79" w:color="auto" w:val="clear"/>
+            <w:tcMar>
+              <w:top w:type="dxa" w:w="50"/>
+              <w:left w:type="dxa" w:w="90"/>
+              <w:bottom w:type="dxa" w:w="50"/>
+              <w:right w:type="dxa" w:w="90"/>
+            </w:tcMar>
+            <w:vAlign w:val="center"/>
+          </w:tcPr>
+          <w:p>
+            <w:pPr>
+              <w:spacing w:after="0"/>
+            </w:pPr>
+            <w:r>
+              <w:rPr>
+                <w:b/>
+                <w:bCs/>
+                <w:color w:val="FFFFFF"/>
+                <w:sz w:val="18"/>
+                <w:szCs w:val="18"/>
+              </w:rPr>
+              <w:t xml:space="preserve">Part</w:t>
+            </w:r>
+          </w:p>
+        </w:tc>
+        <w:tc>
+          <w:tcPr>
+            <w:tcW w:type="dxa" w:w="1800"/>
+            <w:tcBorders>
+              <w:top w:val="single" w:color="BFBFBF" w:sz="4"/>
+              <w:left w:val="single" w:color="BFBFBF" w:sz="4"/>
+              <w:bottom w:val="single" w:color="BFBFBF" w:sz="4"/>
+              <w:right w:val="single" w:color="BFBFBF" w:sz="4"/>
+            </w:tcBorders>
+            <w:shd w:fill="1F4E79" w:color="auto" w:val="clear"/>
+            <w:tcMar>
+              <w:top w:type="dxa" w:w="50"/>
+              <w:left w:type="dxa" w:w="90"/>
+              <w:bottom w:type="dxa" w:w="50"/>
+              <w:right w:type="dxa" w:w="90"/>
+            </w:tcMar>
+            <w:vAlign w:val="center"/>
+          </w:tcPr>
+          <w:p>
+            <w:pPr>
+              <w:spacing w:after="0"/>
+            </w:pPr>
+            <w:r>
+              <w:rPr>
+                <w:b/>
+                <w:bCs/>
+                <w:color w:val="FFFFFF"/>
+                <w:sz w:val="18"/>
+                <w:szCs w:val="18"/>
+              </w:rPr>
+              <w:t xml:space="preserve">Effectif estimé</w:t>
+            </w:r>
+          </w:p>
+        </w:tc>
+        <w:tc>
+          <w:tcPr>
+            <w:tcW w:type="dxa" w:w="4038"/>
+            <w:tcBorders>
+              <w:top w:val="single" w:color="BFBFBF" w:sz="4"/>
+              <w:left w:val="single" w:color="BFBFBF" w:sz="4"/>
+              <w:bottom w:val="single" w:color="BFBFBF" w:sz="4"/>
+              <w:right w:val="single" w:color="BFBFBF" w:sz="4"/>
+            </w:tcBorders>
+            <w:shd w:fill="1F4E79" w:color="auto" w:val="clear"/>
+            <w:tcMar>
+              <w:top w:type="dxa" w:w="50"/>
+              <w:left w:type="dxa" w:w="90"/>
+              <w:bottom w:type="dxa" w:w="50"/>
+              <w:right w:type="dxa" w:w="90"/>
+            </w:tcMar>
+            <w:vAlign w:val="center"/>
+          </w:tcPr>
+          <w:p>
+            <w:pPr>
+              <w:spacing w:after="0"/>
+            </w:pPr>
+            <w:r>
+              <w:rPr>
+                <w:b/>
+                <w:bCs/>
+                <w:color w:val="FFFFFF"/>
+                <w:sz w:val="18"/>
+                <w:szCs w:val="18"/>
+              </w:rPr>
+              <w:t xml:space="preserve">Enjeu</w:t>
+            </w:r>
+          </w:p>
+        </w:tc>
+      </w:tr>
+      <w:tr>
+        <w:tc>
+          <w:tcPr>
+            <w:tcW w:type="dxa" w:w="2600"/>
+            <w:tcBorders>
+              <w:top w:val="single" w:color="BFBFBF" w:sz="4"/>
+              <w:left w:val="single" w:color="BFBFBF" w:sz="4"/>
+              <w:bottom w:val="single" w:color="BFBFBF" w:sz="4"/>
+              <w:right w:val="single" w:color="BFBFBF" w:sz="4"/>
+            </w:tcBorders>
+            <w:shd w:fill="DEEAF6" w:color="auto" w:val="clear"/>
+            <w:tcMar>
+              <w:top w:type="dxa" w:w="50"/>
+              <w:left w:type="dxa" w:w="90"/>
+              <w:bottom w:type="dxa" w:w="50"/>
+              <w:right w:type="dxa" w:w="90"/>
+            </w:tcMar>
+            <w:vAlign w:val="center"/>
+          </w:tcPr>
+          <w:p>
+            <w:pPr>
+              <w:spacing w:after="0"/>
+            </w:pPr>
+            <w:r>
+              <w:rPr>
+                <w:sz w:val="18"/>
+                <w:szCs w:val="18"/>
+              </w:rPr>
+              <w:t xml:space="preserve">Moins de 50 ans</w:t>
+            </w:r>
+          </w:p>
+        </w:tc>
+        <w:tc>
+          <w:tcPr>
+            <w:tcW w:type="dxa" w:w="1200"/>
+            <w:tcBorders>
+              <w:top w:val="single" w:color="BFBFBF" w:sz="4"/>
+              <w:left w:val="single" w:color="BFBFBF" w:sz="4"/>
+              <w:bottom w:val="single" w:color="BFBFBF" w:sz="4"/>
+              <w:right w:val="single" w:color="BFBFBF" w:sz="4"/>
+            </w:tcBorders>
+            <w:tcMar>
+              <w:top w:type="dxa" w:w="50"/>
+              <w:left w:type="dxa" w:w="90"/>
+              <w:bottom w:type="dxa" w:w="50"/>
+              <w:right w:type="dxa" w:w="90"/>
+            </w:tcMar>
+            <w:vAlign w:val="center"/>
+          </w:tcPr>
+          <w:p>
+            <w:pPr>
+              <w:spacing w:after="0"/>
+            </w:pPr>
+            <w:r>
+              <w:rPr>
+                <w:sz w:val="18"/>
+                <w:szCs w:val="18"/>
+              </w:rPr>
+              <w:t xml:space="preserve">55 %</w:t>
+            </w:r>
+          </w:p>
+        </w:tc>
+        <w:tc>
+          <w:tcPr>
+            <w:tcW w:type="dxa" w:w="1800"/>
+            <w:tcBorders>
+              <w:top w:val="single" w:color="BFBFBF" w:sz="4"/>
+              <w:left w:val="single" w:color="BFBFBF" w:sz="4"/>
+              <w:bottom w:val="single" w:color="BFBFBF" w:sz="4"/>
+              <w:right w:val="single" w:color="BFBFBF" w:sz="4"/>
+            </w:tcBorders>
+            <w:tcMar>
+              <w:top w:type="dxa" w:w="50"/>
+              <w:left w:type="dxa" w:w="90"/>
+              <w:bottom w:type="dxa" w:w="50"/>
+              <w:right w:type="dxa" w:w="90"/>
+            </w:tcMar>
+            <w:vAlign w:val="center"/>
+          </w:tcPr>
+          <w:p>
+            <w:pPr>
+              <w:spacing w:after="0"/>
+            </w:pPr>
+            <w:r>
+              <w:rPr>
+                <w:sz w:val="18"/>
+                <w:szCs w:val="18"/>
+              </w:rPr>
+              <w:t xml:space="preserve">≈ 209</w:t>
+            </w:r>
+          </w:p>
+        </w:tc>
+        <w:tc>
+          <w:tcPr>
+            <w:tcW w:type="dxa" w:w="4038"/>
+            <w:tcBorders>
+              <w:top w:val="single" w:color="BFBFBF" w:sz="4"/>
+              <w:left w:val="single" w:color="BFBFBF" w:sz="4"/>
+              <w:bottom w:val="single" w:color="BFBFBF" w:sz="4"/>
+              <w:right w:val="single" w:color="BFBFBF" w:sz="4"/>
+            </w:tcBorders>
+            <w:tcMar>
+              <w:top w:type="dxa" w:w="50"/>
+              <w:left w:type="dxa" w:w="90"/>
+              <w:bottom w:type="dxa" w:w="50"/>
+              <w:right w:type="dxa" w:w="90"/>
+            </w:tcMar>
+            <w:vAlign w:val="center"/>
+          </w:tcPr>
+          <w:p>
+            <w:pPr>
+              <w:spacing w:after="0"/>
+            </w:pPr>
+            <w:r>
+              <w:rPr>
+                <w:sz w:val="18"/>
+                <w:szCs w:val="18"/>
+              </w:rPr>
+              <w:t xml:space="preserve">Relève à former aux nouvelles compétences</w:t>
+            </w:r>
+          </w:p>
+        </w:tc>
+      </w:tr>
+      <w:tr>
+        <w:tc>
+          <w:tcPr>
+            <w:tcW w:type="dxa" w:w="2600"/>
+            <w:tcBorders>
+              <w:top w:val="single" w:color="BFBFBF" w:sz="4"/>
+              <w:left w:val="single" w:color="BFBFBF" w:sz="4"/>
+              <w:bottom w:val="single" w:color="BFBFBF" w:sz="4"/>
+              <w:right w:val="single" w:color="BFBFBF" w:sz="4"/>
+            </w:tcBorders>
+            <w:shd w:fill="DEEAF6" w:color="auto" w:val="clear"/>
+            <w:tcMar>
+              <w:top w:type="dxa" w:w="50"/>
+              <w:left w:type="dxa" w:w="90"/>
+              <w:bottom w:type="dxa" w:w="50"/>
+              <w:right w:type="dxa" w:w="90"/>
+            </w:tcMar>
+            <w:vAlign w:val="center"/>
+          </w:tcPr>
+          <w:p>
+            <w:pPr>
+              <w:spacing w:after="0"/>
+            </w:pPr>
+            <w:r>
+              <w:rPr>
+                <w:sz w:val="18"/>
+                <w:szCs w:val="18"/>
+              </w:rPr>
+              <w:t xml:space="preserve">50 à 57 ans</w:t>
+            </w:r>
+          </w:p>
+        </w:tc>
+        <w:tc>
+          <w:tcPr>
+            <w:tcW w:type="dxa" w:w="1200"/>
+            <w:tcBorders>
+              <w:top w:val="single" w:color="BFBFBF" w:sz="4"/>
+              <w:left w:val="single" w:color="BFBFBF" w:sz="4"/>
+              <w:bottom w:val="single" w:color="BFBFBF" w:sz="4"/>
+              <w:right w:val="single" w:color="BFBFBF" w:sz="4"/>
+            </w:tcBorders>
+            <w:shd w:fill="F7F9FC" w:color="auto" w:val="clear"/>
+            <w:tcMar>
+              <w:top w:type="dxa" w:w="50"/>
+              <w:left w:type="dxa" w:w="90"/>
+              <w:bottom w:type="dxa" w:w="50"/>
+              <w:right w:type="dxa" w:w="90"/>
+            </w:tcMar>
+            <w:vAlign w:val="center"/>
+          </w:tcPr>
+          <w:p>
+            <w:pPr>
+              <w:spacing w:after="0"/>
+            </w:pPr>
+            <w:r>
+              <w:rPr>
+                <w:sz w:val="18"/>
+                <w:szCs w:val="18"/>
+              </w:rPr>
+              <w:t xml:space="preserve">20 %</w:t>
+            </w:r>
+          </w:p>
+        </w:tc>
+        <w:tc>
+          <w:tcPr>
+            <w:tcW w:type="dxa" w:w="1800"/>
+            <w:tcBorders>
+              <w:top w:val="single" w:color="BFBFBF" w:sz="4"/>
+              <w:left w:val="single" w:color="BFBFBF" w:sz="4"/>
+              <w:bottom w:val="single" w:color="BFBFBF" w:sz="4"/>
+              <w:right w:val="single" w:color="BFBFBF" w:sz="4"/>
+            </w:tcBorders>
+            <w:shd w:fill="F7F9FC" w:color="auto" w:val="clear"/>
+            <w:tcMar>
+              <w:top w:type="dxa" w:w="50"/>
+              <w:left w:type="dxa" w:w="90"/>
+              <w:bottom w:type="dxa" w:w="50"/>
+              <w:right w:type="dxa" w:w="90"/>
+            </w:tcMar>
+            <w:vAlign w:val="center"/>
+          </w:tcPr>
+          <w:p>
+            <w:pPr>
+              <w:spacing w:after="0"/>
+            </w:pPr>
+            <w:r>
+              <w:rPr>
+                <w:sz w:val="18"/>
+                <w:szCs w:val="18"/>
+              </w:rPr>
+              <w:t xml:space="preserve">≈ 76</w:t>
+            </w:r>
+          </w:p>
+        </w:tc>
+        <w:tc>
+          <w:tcPr>
+            <w:tcW w:type="dxa" w:w="4038"/>
+            <w:tcBorders>
+              <w:top w:val="single" w:color="BFBFBF" w:sz="4"/>
+              <w:left w:val="single" w:color="BFBFBF" w:sz="4"/>
+              <w:bottom w:val="single" w:color="BFBFBF" w:sz="4"/>
+              <w:right w:val="single" w:color="BFBFBF" w:sz="4"/>
+            </w:tcBorders>
+            <w:shd w:fill="F7F9FC" w:color="auto" w:val="clear"/>
+            <w:tcMar>
+              <w:top w:type="dxa" w:w="50"/>
+              <w:left w:type="dxa" w:w="90"/>
+              <w:bottom w:type="dxa" w:w="50"/>
+              <w:right w:type="dxa" w:w="90"/>
+            </w:tcMar>
+            <w:vAlign w:val="center"/>
+          </w:tcPr>
+          <w:p>
+            <w:pPr>
+              <w:spacing w:after="0"/>
+            </w:pPr>
+            <w:r>
+              <w:rPr>
+                <w:sz w:val="18"/>
+                <w:szCs w:val="18"/>
+              </w:rPr>
+              <w:t xml:space="preserve">Départs à horizon 7–12 ans</w:t>
+            </w:r>
+          </w:p>
+        </w:tc>
+      </w:tr>
+      <w:tr>
+        <w:tc>
+          <w:tcPr>
+            <w:tcW w:type="dxa" w:w="2600"/>
+            <w:tcBorders>
+              <w:top w:val="single" w:color="BFBFBF" w:sz="4"/>
+              <w:left w:val="single" w:color="BFBFBF" w:sz="4"/>
+              <w:bottom w:val="single" w:color="BFBFBF" w:sz="4"/>
+              <w:right w:val="single" w:color="BFBFBF" w:sz="4"/>
+            </w:tcBorders>
+            <w:shd w:fill="DEEAF6" w:color="auto" w:val="clear"/>
+            <w:tcMar>
+              <w:top w:type="dxa" w:w="50"/>
+              <w:left w:type="dxa" w:w="90"/>
+              <w:bottom w:type="dxa" w:w="50"/>
+              <w:right w:type="dxa" w:w="90"/>
+            </w:tcMar>
+            <w:vAlign w:val="center"/>
+          </w:tcPr>
+          <w:p>
+            <w:pPr>
+              <w:spacing w:after="0"/>
+            </w:pPr>
+            <w:r>
+              <w:rPr>
+                <w:sz w:val="18"/>
+                <w:szCs w:val="18"/>
+              </w:rPr>
+              <w:t xml:space="preserve">Plus de 57 ans</w:t>
+            </w:r>
+          </w:p>
+        </w:tc>
+        <w:tc>
+          <w:tcPr>
+            <w:tcW w:type="dxa" w:w="1200"/>
+            <w:tcBorders>
+              <w:top w:val="single" w:color="BFBFBF" w:sz="4"/>
+              <w:left w:val="single" w:color="BFBFBF" w:sz="4"/>
+              <w:bottom w:val="single" w:color="BFBFBF" w:sz="4"/>
+              <w:right w:val="single" w:color="BFBFBF" w:sz="4"/>
+            </w:tcBorders>
+            <w:tcMar>
+              <w:top w:type="dxa" w:w="50"/>
+              <w:left w:type="dxa" w:w="90"/>
+              <w:bottom w:type="dxa" w:w="50"/>
+              <w:right w:type="dxa" w:w="90"/>
+            </w:tcMar>
+            <w:vAlign w:val="center"/>
+          </w:tcPr>
+          <w:p>
+            <w:pPr>
+              <w:spacing w:after="0"/>
+            </w:pPr>
+            <w:r>
+              <w:rPr>
+                <w:sz w:val="18"/>
+                <w:szCs w:val="18"/>
+              </w:rPr>
+              <w:t xml:space="preserve">25 %</w:t>
+            </w:r>
+          </w:p>
+        </w:tc>
+        <w:tc>
+          <w:tcPr>
+            <w:tcW w:type="dxa" w:w="1800"/>
+            <w:tcBorders>
+              <w:top w:val="single" w:color="BFBFBF" w:sz="4"/>
+              <w:left w:val="single" w:color="BFBFBF" w:sz="4"/>
+              <w:bottom w:val="single" w:color="BFBFBF" w:sz="4"/>
+              <w:right w:val="single" w:color="BFBFBF" w:sz="4"/>
+            </w:tcBorders>
+            <w:tcMar>
+              <w:top w:type="dxa" w:w="50"/>
+              <w:left w:type="dxa" w:w="90"/>
+              <w:bottom w:type="dxa" w:w="50"/>
+              <w:right w:type="dxa" w:w="90"/>
+            </w:tcMar>
+            <w:vAlign w:val="center"/>
+          </w:tcPr>
+          <w:p>
+            <w:pPr>
+              <w:spacing w:after="0"/>
+            </w:pPr>
+            <w:r>
+              <w:rPr>
+                <w:sz w:val="18"/>
+                <w:szCs w:val="18"/>
+              </w:rPr>
+              <w:t xml:space="preserve">≈ 95</w:t>
+            </w:r>
+          </w:p>
+        </w:tc>
+        <w:tc>
+          <w:tcPr>
+            <w:tcW w:type="dxa" w:w="4038"/>
+            <w:tcBorders>
+              <w:top w:val="single" w:color="BFBFBF" w:sz="4"/>
+              <w:left w:val="single" w:color="BFBFBF" w:sz="4"/>
+              <w:bottom w:val="single" w:color="BFBFBF" w:sz="4"/>
+              <w:right w:val="single" w:color="BFBFBF" w:sz="4"/>
+            </w:tcBorders>
+            <w:tcMar>
+              <w:top w:type="dxa" w:w="50"/>
+              <w:left w:type="dxa" w:w="90"/>
+              <w:bottom w:type="dxa" w:w="50"/>
+              <w:right w:type="dxa" w:w="90"/>
+            </w:tcMar>
+            <w:vAlign w:val="center"/>
+          </w:tcPr>
+          <w:p>
+            <w:pPr>
+              <w:spacing w:after="0"/>
+            </w:pPr>
+            <w:r>
+              <w:rPr>
+                <w:sz w:val="18"/>
+                <w:szCs w:val="18"/>
+              </w:rPr>
+              <w:t xml:space="preserve">Départs probables d’ici 5–7 ans</w:t>
+            </w:r>
+          </w:p>
+        </w:tc>
+      </w:tr>
+      <w:tr>
+        <w:tc>
+          <w:tcPr>
+            <w:tcW w:type="dxa" w:w="2600"/>
+            <w:tcBorders>
+              <w:top w:val="single" w:color="BFBFBF" w:sz="4"/>
+              <w:left w:val="single" w:color="BFBFBF" w:sz="4"/>
+              <w:bottom w:val="single" w:color="BFBFBF" w:sz="4"/>
+              <w:right w:val="single" w:color="BFBFBF" w:sz="4"/>
+            </w:tcBorders>
+            <w:shd w:fill="DEEAF6" w:color="auto" w:val="clear"/>
+            <w:tcMar>
+              <w:top w:type="dxa" w:w="50"/>
+              <w:left w:type="dxa" w:w="90"/>
+              <w:bottom w:type="dxa" w:w="50"/>
+              <w:right w:type="dxa" w:w="90"/>
+            </w:tcMar>
+            <w:vAlign w:val="center"/>
+          </w:tcPr>
+          <w:p>
+            <w:pPr>
+              <w:spacing w:after="0"/>
+            </w:pPr>
+            <w:r>
+              <w:rPr>
+                <w:sz w:val="18"/>
+                <w:szCs w:val="18"/>
+              </w:rPr>
+              <w:t xml:space="preserve">Total DST</w:t>
+            </w:r>
+          </w:p>
+        </w:tc>
+        <w:tc>
+          <w:tcPr>
+            <w:tcW w:type="dxa" w:w="1200"/>
+            <w:tcBorders>
+              <w:top w:val="single" w:color="BFBFBF" w:sz="4"/>
+              <w:left w:val="single" w:color="BFBFBF" w:sz="4"/>
+              <w:bottom w:val="single" w:color="BFBFBF" w:sz="4"/>
+              <w:right w:val="single" w:color="BFBFBF" w:sz="4"/>
+            </w:tcBorders>
+            <w:shd w:fill="F7F9FC" w:color="auto" w:val="clear"/>
+            <w:tcMar>
+              <w:top w:type="dxa" w:w="50"/>
+              <w:left w:type="dxa" w:w="90"/>
+              <w:bottom w:type="dxa" w:w="50"/>
+              <w:right w:type="dxa" w:w="90"/>
+            </w:tcMar>
+            <w:vAlign w:val="center"/>
+          </w:tcPr>
+          <w:p>
+            <w:pPr>
+              <w:spacing w:after="0"/>
+            </w:pPr>
+            <w:r>
+              <w:rPr>
+                <w:sz w:val="18"/>
+                <w:szCs w:val="18"/>
+              </w:rPr>
+              <w:t xml:space="preserve">100 %</w:t>
+            </w:r>
+          </w:p>
+        </w:tc>
+        <w:tc>
+          <w:tcPr>
+            <w:tcW w:type="dxa" w:w="1800"/>
+            <w:tcBorders>
+              <w:top w:val="single" w:color="BFBFBF" w:sz="4"/>
+              <w:left w:val="single" w:color="BFBFBF" w:sz="4"/>
+              <w:bottom w:val="single" w:color="BFBFBF" w:sz="4"/>
+              <w:right w:val="single" w:color="BFBFBF" w:sz="4"/>
+            </w:tcBorders>
+            <w:shd w:fill="F7F9FC" w:color="auto" w:val="clear"/>
+            <w:tcMar>
+              <w:top w:type="dxa" w:w="50"/>
+              <w:left w:type="dxa" w:w="90"/>
+              <w:bottom w:type="dxa" w:w="50"/>
+              <w:right w:type="dxa" w:w="90"/>
+            </w:tcMar>
+            <w:vAlign w:val="center"/>
+          </w:tcPr>
+          <w:p>
+            <w:pPr>
+              <w:spacing w:after="0"/>
+            </w:pPr>
+            <w:r>
+              <w:rPr>
+                <w:sz w:val="18"/>
+                <w:szCs w:val="18"/>
+              </w:rPr>
+              <w:t xml:space="preserve">380</w:t>
+            </w:r>
+          </w:p>
+        </w:tc>
+        <w:tc>
+          <w:tcPr>
+            <w:tcW w:type="dxa" w:w="4038"/>
+            <w:tcBorders>
+              <w:top w:val="single" w:color="BFBFBF" w:sz="4"/>
+              <w:left w:val="single" w:color="BFBFBF" w:sz="4"/>
+              <w:bottom w:val="single" w:color="BFBFBF" w:sz="4"/>
+              <w:right w:val="single" w:color="BFBFBF" w:sz="4"/>
+            </w:tcBorders>
+            <w:shd w:fill="F7F9FC" w:color="auto" w:val="clear"/>
+            <w:tcMar>
+              <w:top w:type="dxa" w:w="50"/>
+              <w:left w:type="dxa" w:w="90"/>
+              <w:bottom w:type="dxa" w:w="50"/>
+              <w:right w:type="dxa" w:w="90"/>
+            </w:tcMar>
+            <w:vAlign w:val="center"/>
+          </w:tcPr>
+          <w:p>
+            <w:pPr>
+              <w:spacing w:after="0"/>
+            </w:pPr>
+            <w:r>
+              <w:rPr>
+                <w:sz w:val="18"/>
+                <w:szCs w:val="18"/>
+              </w:rPr>
+              <w:t xml:space="preserve">dont 45 % de plus de 50 ans (≈ 171)</w:t>
+            </w:r>
+          </w:p>
+        </w:tc>
+      </w:tr>
+    </w:tbl>
     <w:p>
       <w:pPr>
         <w:spacing w:after="140"/>
@@ -1111,7 +1677,7 @@
           <w:sz w:val="18"/>
           <w:szCs w:val="18"/>
         </w:rPr>
-        <w:t xml:space="preserve">Graphique 2 – Structure par âge de la DST (effectifs estimés à partir des pourcentages fournis)</w:t>
+        <w:t xml:space="preserve">Tableau 2 – Structure par âge de la DST (effectifs estimés à partir des pourcentages fournis)</w:t>
       </w:r>
     </w:p>
     <w:p>
@@ -1161,52 +1727,538 @@
         <w:t xml:space="preserve">1.3 Flux : turnover, mobilité et formation</w:t>
       </w:r>
     </w:p>
-    <w:p>
-      <w:pPr>
-        <w:spacing w:after="40" w:before="80"/>
-        <w:jc w:val="center"/>
-      </w:pPr>
-      <w:r>
-        <w:drawing>
-          <wp:inline distT="0" distB="0" distL="0" distR="0">
-            <wp:extent cx="5334000" cy="1333500"/>
-            <wp:effectExtent t="0" r="0" b="0" l="0"/>
-            <wp:docPr id="1" name="" descr="" title=""/>
-            <wp:cNvGraphicFramePr>
-              <a:graphicFrameLocks xmlns:a="http://schemas.openxmlformats.org/drawingml/2006/main" noChangeAspect="1"/>
-            </wp:cNvGraphicFramePr>
-            <a:graphic xmlns:a="http://schemas.openxmlformats.org/drawingml/2006/main">
-              <a:graphicData uri="http://schemas.openxmlformats.org/drawingml/2006/picture">
-                <pic:pic xmlns:pic="http://schemas.openxmlformats.org/drawingml/2006/picture">
-                  <pic:nvPicPr>
-                    <pic:cNvPr id="0" name="" descr=""/>
-                    <pic:cNvPicPr>
-                      <a:picLocks noChangeAspect="1" noChangeArrowheads="1"/>
-                    </pic:cNvPicPr>
-                  </pic:nvPicPr>
-                  <pic:blipFill>
-                    <a:blip r:embed="rId10" cstate="none"/>
-                    <a:srcRect/>
-                    <a:stretch>
-                      <a:fillRect/>
-                    </a:stretch>
-                  </pic:blipFill>
-                  <pic:spPr bwMode="auto">
-                    <a:xfrm>
-                      <a:off x="0" y="0"/>
-                      <a:ext cx="5334000" cy="1333500"/>
-                    </a:xfrm>
-                    <a:prstGeom prst="rect">
-                      <a:avLst/>
-                    </a:prstGeom>
-                  </pic:spPr>
-                </pic:pic>
-              </a:graphicData>
-            </a:graphic>
-          </wp:inline>
-        </w:drawing>
-      </w:r>
-    </w:p>
+    <w:tbl>
+      <w:tblPr>
+        <w:tblW w:type="dxa" w:w="9638"/>
+        <w:tblBorders>
+          <w:top w:val="single" w:color="auto" w:sz="4"/>
+          <w:left w:val="single" w:color="auto" w:sz="4"/>
+          <w:bottom w:val="single" w:color="auto" w:sz="4"/>
+          <w:right w:val="single" w:color="auto" w:sz="4"/>
+          <w:insideH w:val="single" w:color="auto" w:sz="4"/>
+          <w:insideV w:val="single" w:color="auto" w:sz="4"/>
+        </w:tblBorders>
+      </w:tblPr>
+      <w:tblGrid>
+        <w:gridCol w:w="3238"/>
+        <w:gridCol w:w="2000"/>
+        <w:gridCol w:w="2200"/>
+        <w:gridCol w:w="2200"/>
+      </w:tblGrid>
+      <w:tr>
+        <w:trPr>
+          <w:tblHeader/>
+        </w:trPr>
+        <w:tc>
+          <w:tcPr>
+            <w:tcW w:type="dxa" w:w="3238"/>
+            <w:tcBorders>
+              <w:top w:val="single" w:color="BFBFBF" w:sz="4"/>
+              <w:left w:val="single" w:color="BFBFBF" w:sz="4"/>
+              <w:bottom w:val="single" w:color="BFBFBF" w:sz="4"/>
+              <w:right w:val="single" w:color="BFBFBF" w:sz="4"/>
+            </w:tcBorders>
+            <w:shd w:fill="1F4E79" w:color="auto" w:val="clear"/>
+            <w:tcMar>
+              <w:top w:type="dxa" w:w="50"/>
+              <w:left w:type="dxa" w:w="90"/>
+              <w:bottom w:type="dxa" w:w="50"/>
+              <w:right w:type="dxa" w:w="90"/>
+            </w:tcMar>
+            <w:vAlign w:val="center"/>
+          </w:tcPr>
+          <w:p>
+            <w:pPr>
+              <w:spacing w:after="0"/>
+            </w:pPr>
+            <w:r>
+              <w:rPr>
+                <w:b/>
+                <w:bCs/>
+                <w:color w:val="FFFFFF"/>
+                <w:sz w:val="18"/>
+                <w:szCs w:val="18"/>
+              </w:rPr>
+              <w:t xml:space="preserve">Flux</w:t>
+            </w:r>
+          </w:p>
+        </w:tc>
+        <w:tc>
+          <w:tcPr>
+            <w:tcW w:type="dxa" w:w="2000"/>
+            <w:tcBorders>
+              <w:top w:val="single" w:color="BFBFBF" w:sz="4"/>
+              <w:left w:val="single" w:color="BFBFBF" w:sz="4"/>
+              <w:bottom w:val="single" w:color="BFBFBF" w:sz="4"/>
+              <w:right w:val="single" w:color="BFBFBF" w:sz="4"/>
+            </w:tcBorders>
+            <w:shd w:fill="1F4E79" w:color="auto" w:val="clear"/>
+            <w:tcMar>
+              <w:top w:type="dxa" w:w="50"/>
+              <w:left w:type="dxa" w:w="90"/>
+              <w:bottom w:type="dxa" w:w="50"/>
+              <w:right w:type="dxa" w:w="90"/>
+            </w:tcMar>
+            <w:vAlign w:val="center"/>
+          </w:tcPr>
+          <w:p>
+            <w:pPr>
+              <w:spacing w:after="0"/>
+            </w:pPr>
+            <w:r>
+              <w:rPr>
+                <w:b/>
+                <w:bCs/>
+                <w:color w:val="FFFFFF"/>
+                <w:sz w:val="18"/>
+                <w:szCs w:val="18"/>
+              </w:rPr>
+              <w:t xml:space="preserve">Taux fourni</w:t>
+            </w:r>
+          </w:p>
+        </w:tc>
+        <w:tc>
+          <w:tcPr>
+            <w:tcW w:type="dxa" w:w="2200"/>
+            <w:tcBorders>
+              <w:top w:val="single" w:color="BFBFBF" w:sz="4"/>
+              <w:left w:val="single" w:color="BFBFBF" w:sz="4"/>
+              <w:bottom w:val="single" w:color="BFBFBF" w:sz="4"/>
+              <w:right w:val="single" w:color="BFBFBF" w:sz="4"/>
+            </w:tcBorders>
+            <w:shd w:fill="1F4E79" w:color="auto" w:val="clear"/>
+            <w:tcMar>
+              <w:top w:type="dxa" w:w="50"/>
+              <w:left w:type="dxa" w:w="90"/>
+              <w:bottom w:type="dxa" w:w="50"/>
+              <w:right w:type="dxa" w:w="90"/>
+            </w:tcMar>
+            <w:vAlign w:val="center"/>
+          </w:tcPr>
+          <w:p>
+            <w:pPr>
+              <w:spacing w:after="0"/>
+            </w:pPr>
+            <w:r>
+              <w:rPr>
+                <w:b/>
+                <w:bCs/>
+                <w:color w:val="FFFFFF"/>
+                <w:sz w:val="18"/>
+                <w:szCs w:val="18"/>
+              </w:rPr>
+              <w:t xml:space="preserve">Sur 3 ans</w:t>
+            </w:r>
+          </w:p>
+        </w:tc>
+        <w:tc>
+          <w:tcPr>
+            <w:tcW w:type="dxa" w:w="2200"/>
+            <w:tcBorders>
+              <w:top w:val="single" w:color="BFBFBF" w:sz="4"/>
+              <w:left w:val="single" w:color="BFBFBF" w:sz="4"/>
+              <w:bottom w:val="single" w:color="BFBFBF" w:sz="4"/>
+              <w:right w:val="single" w:color="BFBFBF" w:sz="4"/>
+            </w:tcBorders>
+            <w:shd w:fill="1F4E79" w:color="auto" w:val="clear"/>
+            <w:tcMar>
+              <w:top w:type="dxa" w:w="50"/>
+              <w:left w:type="dxa" w:w="90"/>
+              <w:bottom w:type="dxa" w:w="50"/>
+              <w:right w:type="dxa" w:w="90"/>
+            </w:tcMar>
+            <w:vAlign w:val="center"/>
+          </w:tcPr>
+          <w:p>
+            <w:pPr>
+              <w:spacing w:after="0"/>
+            </w:pPr>
+            <w:r>
+              <w:rPr>
+                <w:b/>
+                <w:bCs/>
+                <w:color w:val="FFFFFF"/>
+                <w:sz w:val="18"/>
+                <w:szCs w:val="18"/>
+              </w:rPr>
+              <w:t xml:space="preserve">Par an</w:t>
+            </w:r>
+          </w:p>
+        </w:tc>
+      </w:tr>
+      <w:tr>
+        <w:tc>
+          <w:tcPr>
+            <w:tcW w:type="dxa" w:w="3238"/>
+            <w:tcBorders>
+              <w:top w:val="single" w:color="BFBFBF" w:sz="4"/>
+              <w:left w:val="single" w:color="BFBFBF" w:sz="4"/>
+              <w:bottom w:val="single" w:color="BFBFBF" w:sz="4"/>
+              <w:right w:val="single" w:color="BFBFBF" w:sz="4"/>
+            </w:tcBorders>
+            <w:shd w:fill="DEEAF6" w:color="auto" w:val="clear"/>
+            <w:tcMar>
+              <w:top w:type="dxa" w:w="50"/>
+              <w:left w:type="dxa" w:w="90"/>
+              <w:bottom w:type="dxa" w:w="50"/>
+              <w:right w:type="dxa" w:w="90"/>
+            </w:tcMar>
+            <w:vAlign w:val="center"/>
+          </w:tcPr>
+          <w:p>
+            <w:pPr>
+              <w:spacing w:after="0"/>
+            </w:pPr>
+            <w:r>
+              <w:rPr>
+                <w:sz w:val="18"/>
+                <w:szCs w:val="18"/>
+              </w:rPr>
+              <w:t xml:space="preserve">Départs (turnover)</w:t>
+            </w:r>
+          </w:p>
+        </w:tc>
+        <w:tc>
+          <w:tcPr>
+            <w:tcW w:type="dxa" w:w="2000"/>
+            <w:tcBorders>
+              <w:top w:val="single" w:color="BFBFBF" w:sz="4"/>
+              <w:left w:val="single" w:color="BFBFBF" w:sz="4"/>
+              <w:bottom w:val="single" w:color="BFBFBF" w:sz="4"/>
+              <w:right w:val="single" w:color="BFBFBF" w:sz="4"/>
+            </w:tcBorders>
+            <w:tcMar>
+              <w:top w:type="dxa" w:w="50"/>
+              <w:left w:type="dxa" w:w="90"/>
+              <w:bottom w:type="dxa" w:w="50"/>
+              <w:right w:type="dxa" w:w="90"/>
+            </w:tcMar>
+            <w:vAlign w:val="center"/>
+          </w:tcPr>
+          <w:p>
+            <w:pPr>
+              <w:spacing w:after="0"/>
+            </w:pPr>
+            <w:r>
+              <w:rPr>
+                <w:sz w:val="18"/>
+                <w:szCs w:val="18"/>
+              </w:rPr>
+              <w:t xml:space="preserve">6 % par an</w:t>
+            </w:r>
+          </w:p>
+        </w:tc>
+        <w:tc>
+          <w:tcPr>
+            <w:tcW w:type="dxa" w:w="2200"/>
+            <w:tcBorders>
+              <w:top w:val="single" w:color="BFBFBF" w:sz="4"/>
+              <w:left w:val="single" w:color="BFBFBF" w:sz="4"/>
+              <w:bottom w:val="single" w:color="BFBFBF" w:sz="4"/>
+              <w:right w:val="single" w:color="BFBFBF" w:sz="4"/>
+            </w:tcBorders>
+            <w:tcMar>
+              <w:top w:type="dxa" w:w="50"/>
+              <w:left w:type="dxa" w:w="90"/>
+              <w:bottom w:type="dxa" w:w="50"/>
+              <w:right w:type="dxa" w:w="90"/>
+            </w:tcMar>
+            <w:vAlign w:val="center"/>
+          </w:tcPr>
+          <w:p>
+            <w:pPr>
+              <w:spacing w:after="0"/>
+            </w:pPr>
+            <w:r>
+              <w:rPr>
+                <w:sz w:val="18"/>
+                <w:szCs w:val="18"/>
+              </w:rPr>
+              <w:t xml:space="preserve">≈ 170 agents</w:t>
+            </w:r>
+          </w:p>
+        </w:tc>
+        <w:tc>
+          <w:tcPr>
+            <w:tcW w:type="dxa" w:w="2200"/>
+            <w:tcBorders>
+              <w:top w:val="single" w:color="BFBFBF" w:sz="4"/>
+              <w:left w:val="single" w:color="BFBFBF" w:sz="4"/>
+              <w:bottom w:val="single" w:color="BFBFBF" w:sz="4"/>
+              <w:right w:val="single" w:color="BFBFBF" w:sz="4"/>
+            </w:tcBorders>
+            <w:tcMar>
+              <w:top w:type="dxa" w:w="50"/>
+              <w:left w:type="dxa" w:w="90"/>
+              <w:bottom w:type="dxa" w:w="50"/>
+              <w:right w:type="dxa" w:w="90"/>
+            </w:tcMar>
+            <w:vAlign w:val="center"/>
+          </w:tcPr>
+          <w:p>
+            <w:pPr>
+              <w:spacing w:after="0"/>
+            </w:pPr>
+            <w:r>
+              <w:rPr>
+                <w:sz w:val="18"/>
+                <w:szCs w:val="18"/>
+              </w:rPr>
+              <w:t xml:space="preserve">≈ 57 agents</w:t>
+            </w:r>
+          </w:p>
+        </w:tc>
+      </w:tr>
+      <w:tr>
+        <w:tc>
+          <w:tcPr>
+            <w:tcW w:type="dxa" w:w="3238"/>
+            <w:tcBorders>
+              <w:top w:val="single" w:color="BFBFBF" w:sz="4"/>
+              <w:left w:val="single" w:color="BFBFBF" w:sz="4"/>
+              <w:bottom w:val="single" w:color="BFBFBF" w:sz="4"/>
+              <w:right w:val="single" w:color="BFBFBF" w:sz="4"/>
+            </w:tcBorders>
+            <w:shd w:fill="DEEAF6" w:color="auto" w:val="clear"/>
+            <w:tcMar>
+              <w:top w:type="dxa" w:w="50"/>
+              <w:left w:type="dxa" w:w="90"/>
+              <w:bottom w:type="dxa" w:w="50"/>
+              <w:right w:type="dxa" w:w="90"/>
+            </w:tcMar>
+            <w:vAlign w:val="center"/>
+          </w:tcPr>
+          <w:p>
+            <w:pPr>
+              <w:spacing w:after="0"/>
+            </w:pPr>
+            <w:r>
+              <w:rPr>
+                <w:sz w:val="18"/>
+                <w:szCs w:val="18"/>
+              </w:rPr>
+              <w:t xml:space="preserve">Mobilités internes</w:t>
+            </w:r>
+          </w:p>
+        </w:tc>
+        <w:tc>
+          <w:tcPr>
+            <w:tcW w:type="dxa" w:w="2000"/>
+            <w:tcBorders>
+              <w:top w:val="single" w:color="BFBFBF" w:sz="4"/>
+              <w:left w:val="single" w:color="BFBFBF" w:sz="4"/>
+              <w:bottom w:val="single" w:color="BFBFBF" w:sz="4"/>
+              <w:right w:val="single" w:color="BFBFBF" w:sz="4"/>
+            </w:tcBorders>
+            <w:shd w:fill="F7F9FC" w:color="auto" w:val="clear"/>
+            <w:tcMar>
+              <w:top w:type="dxa" w:w="50"/>
+              <w:left w:type="dxa" w:w="90"/>
+              <w:bottom w:type="dxa" w:w="50"/>
+              <w:right w:type="dxa" w:w="90"/>
+            </w:tcMar>
+            <w:vAlign w:val="center"/>
+          </w:tcPr>
+          <w:p>
+            <w:pPr>
+              <w:spacing w:after="0"/>
+            </w:pPr>
+            <w:r>
+              <w:rPr>
+                <w:sz w:val="18"/>
+                <w:szCs w:val="18"/>
+              </w:rPr>
+              <w:t xml:space="preserve">5 % sur 3 ans</w:t>
+            </w:r>
+          </w:p>
+        </w:tc>
+        <w:tc>
+          <w:tcPr>
+            <w:tcW w:type="dxa" w:w="2200"/>
+            <w:tcBorders>
+              <w:top w:val="single" w:color="BFBFBF" w:sz="4"/>
+              <w:left w:val="single" w:color="BFBFBF" w:sz="4"/>
+              <w:bottom w:val="single" w:color="BFBFBF" w:sz="4"/>
+              <w:right w:val="single" w:color="BFBFBF" w:sz="4"/>
+            </w:tcBorders>
+            <w:shd w:fill="F7F9FC" w:color="auto" w:val="clear"/>
+            <w:tcMar>
+              <w:top w:type="dxa" w:w="50"/>
+              <w:left w:type="dxa" w:w="90"/>
+              <w:bottom w:type="dxa" w:w="50"/>
+              <w:right w:type="dxa" w:w="90"/>
+            </w:tcMar>
+            <w:vAlign w:val="center"/>
+          </w:tcPr>
+          <w:p>
+            <w:pPr>
+              <w:spacing w:after="0"/>
+            </w:pPr>
+            <w:r>
+              <w:rPr>
+                <w:sz w:val="18"/>
+                <w:szCs w:val="18"/>
+              </w:rPr>
+              <w:t xml:space="preserve">≈ 48 agents</w:t>
+            </w:r>
+          </w:p>
+        </w:tc>
+        <w:tc>
+          <w:tcPr>
+            <w:tcW w:type="dxa" w:w="2200"/>
+            <w:tcBorders>
+              <w:top w:val="single" w:color="BFBFBF" w:sz="4"/>
+              <w:left w:val="single" w:color="BFBFBF" w:sz="4"/>
+              <w:bottom w:val="single" w:color="BFBFBF" w:sz="4"/>
+              <w:right w:val="single" w:color="BFBFBF" w:sz="4"/>
+            </w:tcBorders>
+            <w:shd w:fill="F7F9FC" w:color="auto" w:val="clear"/>
+            <w:tcMar>
+              <w:top w:type="dxa" w:w="50"/>
+              <w:left w:type="dxa" w:w="90"/>
+              <w:bottom w:type="dxa" w:w="50"/>
+              <w:right w:type="dxa" w:w="90"/>
+            </w:tcMar>
+            <w:vAlign w:val="center"/>
+          </w:tcPr>
+          <w:p>
+            <w:pPr>
+              <w:spacing w:after="0"/>
+            </w:pPr>
+            <w:r>
+              <w:rPr>
+                <w:sz w:val="18"/>
+                <w:szCs w:val="18"/>
+              </w:rPr>
+              <w:t xml:space="preserve">≈ 16 agents</w:t>
+            </w:r>
+          </w:p>
+        </w:tc>
+      </w:tr>
+      <w:tr>
+        <w:tc>
+          <w:tcPr>
+            <w:tcW w:type="dxa" w:w="3238"/>
+            <w:tcBorders>
+              <w:top w:val="single" w:color="BFBFBF" w:sz="4"/>
+              <w:left w:val="single" w:color="BFBFBF" w:sz="4"/>
+              <w:bottom w:val="single" w:color="BFBFBF" w:sz="4"/>
+              <w:right w:val="single" w:color="BFBFBF" w:sz="4"/>
+            </w:tcBorders>
+            <w:shd w:fill="DEEAF6" w:color="auto" w:val="clear"/>
+            <w:tcMar>
+              <w:top w:type="dxa" w:w="50"/>
+              <w:left w:type="dxa" w:w="90"/>
+              <w:bottom w:type="dxa" w:w="50"/>
+              <w:right w:type="dxa" w:w="90"/>
+            </w:tcMar>
+            <w:vAlign w:val="center"/>
+          </w:tcPr>
+          <w:p>
+            <w:pPr>
+              <w:spacing w:after="0"/>
+            </w:pPr>
+            <w:r>
+              <w:rPr>
+                <w:sz w:val="18"/>
+                <w:szCs w:val="18"/>
+              </w:rPr>
+              <w:t xml:space="preserve">Ratio départs / mobilités</w:t>
+            </w:r>
+          </w:p>
+        </w:tc>
+        <w:tc>
+          <w:tcPr>
+            <w:tcW w:type="dxa" w:w="2000"/>
+            <w:tcBorders>
+              <w:top w:val="single" w:color="BFBFBF" w:sz="4"/>
+              <w:left w:val="single" w:color="BFBFBF" w:sz="4"/>
+              <w:bottom w:val="single" w:color="BFBFBF" w:sz="4"/>
+              <w:right w:val="single" w:color="BFBFBF" w:sz="4"/>
+            </w:tcBorders>
+            <w:tcMar>
+              <w:top w:type="dxa" w:w="50"/>
+              <w:left w:type="dxa" w:w="90"/>
+              <w:bottom w:type="dxa" w:w="50"/>
+              <w:right w:type="dxa" w:w="90"/>
+            </w:tcMar>
+            <w:vAlign w:val="center"/>
+          </w:tcPr>
+          <w:p>
+            <w:pPr>
+              <w:spacing w:after="0"/>
+            </w:pPr>
+            <w:r>
+              <w:rPr>
+                <w:sz w:val="18"/>
+                <w:szCs w:val="18"/>
+              </w:rPr>
+              <w:t xml:space="preserve">–</w:t>
+            </w:r>
+          </w:p>
+        </w:tc>
+        <w:tc>
+          <w:tcPr>
+            <w:tcW w:type="dxa" w:w="2200"/>
+            <w:tcBorders>
+              <w:top w:val="single" w:color="BFBFBF" w:sz="4"/>
+              <w:left w:val="single" w:color="BFBFBF" w:sz="4"/>
+              <w:bottom w:val="single" w:color="BFBFBF" w:sz="4"/>
+              <w:right w:val="single" w:color="BFBFBF" w:sz="4"/>
+            </w:tcBorders>
+            <w:tcMar>
+              <w:top w:type="dxa" w:w="50"/>
+              <w:left w:type="dxa" w:w="90"/>
+              <w:bottom w:type="dxa" w:w="50"/>
+              <w:right w:type="dxa" w:w="90"/>
+            </w:tcMar>
+            <w:vAlign w:val="center"/>
+          </w:tcPr>
+          <w:p>
+            <w:pPr>
+              <w:spacing w:after="0"/>
+            </w:pPr>
+            <w:r>
+              <w:rPr>
+                <w:sz w:val="18"/>
+                <w:szCs w:val="18"/>
+              </w:rPr>
+              <w:t xml:space="preserve">–</w:t>
+            </w:r>
+          </w:p>
+        </w:tc>
+        <w:tc>
+          <w:tcPr>
+            <w:tcW w:type="dxa" w:w="2200"/>
+            <w:tcBorders>
+              <w:top w:val="single" w:color="BFBFBF" w:sz="4"/>
+              <w:left w:val="single" w:color="BFBFBF" w:sz="4"/>
+              <w:bottom w:val="single" w:color="BFBFBF" w:sz="4"/>
+              <w:right w:val="single" w:color="BFBFBF" w:sz="4"/>
+            </w:tcBorders>
+            <w:tcMar>
+              <w:top w:type="dxa" w:w="50"/>
+              <w:left w:type="dxa" w:w="90"/>
+              <w:bottom w:type="dxa" w:w="50"/>
+              <w:right w:type="dxa" w:w="90"/>
+            </w:tcMar>
+            <w:vAlign w:val="center"/>
+          </w:tcPr>
+          <w:p>
+            <w:pPr>
+              <w:spacing w:after="0"/>
+            </w:pPr>
+            <w:r>
+              <w:rPr>
+                <w:sz w:val="18"/>
+                <w:szCs w:val="18"/>
+              </w:rPr>
+              <w:t xml:space="preserve">≈ 3,5 pour 1</w:t>
+            </w:r>
+          </w:p>
+        </w:tc>
+      </w:tr>
+    </w:tbl>
     <w:p>
       <w:pPr>
         <w:spacing w:after="140"/>
@@ -1220,7 +2272,7 @@
           <w:sz w:val="18"/>
           <w:szCs w:val="18"/>
         </w:rPr>
-        <w:t xml:space="preserve">Graphique 3 – Départs et mobilités internes annuels estimés</w:t>
+        <w:t xml:space="preserve">Tableau 3 – Départs et mobilités internes estimés (base : 950 agents)</w:t>
       </w:r>
     </w:p>
     <w:p>

</xml_diff>